<commit_message>
Tested Whisper consolidated notebooks
</commit_message>
<xml_diff>
--- a/correspondence/form 2.docx
+++ b/correspondence/form 2.docx
@@ -26,7 +26,140 @@
           <w:szCs w:val="32"/>
           <w:lang w:val="en-GB"/>
         </w:rPr>
-        <w:t>Participant Information Sheet (PR/002): [Project Title]</w:t>
+        <w:t xml:space="preserve">Participant Information Sheet (PR/002): </w:t>
+      </w:r>
+    </w:p>
+    <w:p>
+      <w:proofErr w:type="spellStart"/>
+      <w:r>
+        <w:rPr>
+          <w:b/>
+          <w:bCs/>
+        </w:rPr>
+        <w:t>BrainPower</w:t>
+      </w:r>
+      <w:proofErr w:type="spellEnd"/>
+      <w:r>
+        <w:rPr>
+          <w:b/>
+          <w:bCs/>
+        </w:rPr>
+        <w:t xml:space="preserve"> </w:t>
+      </w:r>
+      <w:r>
+        <w:t xml:space="preserve">is a </w:t>
+      </w:r>
+      <w:r>
+        <w:t xml:space="preserve">hybrid, multi-modal, Automated Essay Scoring (AES) system which orchestrates </w:t>
+      </w:r>
+      <w:r>
+        <w:t xml:space="preserve">three pre-trained AI models </w:t>
+      </w:r>
+    </w:p>
+    <w:p>
+      <w:pPr>
+        <w:pStyle w:val="ListParagraph"/>
+        <w:numPr>
+          <w:ilvl w:val="0"/>
+          <w:numId w:val="5"/>
+        </w:numPr>
+        <w:rPr>
+          <w:b/>
+          <w:bCs/>
+          <w:lang w:val="en-GB"/>
+        </w:rPr>
+      </w:pPr>
+      <w:r>
+        <w:rPr>
+          <w:b/>
+          <w:bCs/>
+        </w:rPr>
+        <w:t>Optical</w:t>
+      </w:r>
+      <w:r>
+        <w:rPr>
+          <w:b/>
+          <w:bCs/>
+        </w:rPr>
+        <w:t xml:space="preserve"> Character Recognition (OCR)</w:t>
+      </w:r>
+      <w:r>
+        <w:t xml:space="preserve"> – to extract handwritten essays and convert them to digital text</w:t>
+      </w:r>
+    </w:p>
+    <w:p>
+      <w:pPr>
+        <w:pStyle w:val="ListParagraph"/>
+        <w:numPr>
+          <w:ilvl w:val="0"/>
+          <w:numId w:val="5"/>
+        </w:numPr>
+        <w:rPr>
+          <w:b/>
+          <w:bCs/>
+          <w:lang w:val="en-GB"/>
+        </w:rPr>
+      </w:pPr>
+      <w:r>
+        <w:rPr>
+          <w:b/>
+          <w:bCs/>
+        </w:rPr>
+        <w:t>Speech-To-Text (STT)</w:t>
+      </w:r>
+      <w:r>
+        <w:t xml:space="preserve"> </w:t>
+      </w:r>
+      <w:r>
+        <w:t>– transcribe spoken essays and convert them to digital text</w:t>
+      </w:r>
+      <w:r>
+        <w:t xml:space="preserve"> </w:t>
+      </w:r>
+    </w:p>
+    <w:p>
+      <w:pPr>
+        <w:pStyle w:val="ListParagraph"/>
+        <w:numPr>
+          <w:ilvl w:val="0"/>
+          <w:numId w:val="5"/>
+        </w:numPr>
+        <w:rPr>
+          <w:b/>
+          <w:bCs/>
+          <w:lang w:val="en-GB"/>
+        </w:rPr>
+      </w:pPr>
+      <w:r>
+        <w:rPr>
+          <w:b/>
+          <w:bCs/>
+        </w:rPr>
+        <w:t>Transformer model</w:t>
+      </w:r>
+      <w:r>
+        <w:t xml:space="preserve"> – to evaluate and provide a holistic score for an essay supplied as digital text</w:t>
+      </w:r>
+    </w:p>
+    <w:p>
+      <w:pPr>
+        <w:rPr>
+          <w:b/>
+          <w:bCs/>
+          <w:lang w:val="en-GB"/>
+        </w:rPr>
+      </w:pPr>
+      <w:r>
+        <w:t xml:space="preserve">To </w:t>
+      </w:r>
+      <w:r>
+        <w:t>provid</w:t>
+      </w:r>
+      <w:r>
+        <w:t>e</w:t>
+      </w:r>
+      <w:r>
+        <w:t xml:space="preserve"> accessibility for students and interpretability, readability and automation in support of human scorers.</w:t>
       </w:r>
     </w:p>
     <w:p>
@@ -110,26 +243,8 @@
       </w:r>
     </w:p>
     <w:p>
-      <w:pPr>
-        <w:spacing w:beforeAutospacing="0" w:after="0" w:line="240" w:lineRule="atLeast"/>
-        <w:jc w:val="both"/>
-        <w:rPr>
-          <w:rFonts w:cs="Arial"/>
-          <w:sz w:val="22"/>
-          <w:szCs w:val="22"/>
-          <w:shd w:val="clear" w:color="auto" w:fill="FFFF00"/>
-          <w:lang w:val="en-GB"/>
-        </w:rPr>
-      </w:pPr>
-      <w:r>
-        <w:rPr>
-          <w:rFonts w:cs="Arial"/>
-          <w:sz w:val="22"/>
-          <w:szCs w:val="22"/>
-          <w:shd w:val="clear" w:color="auto" w:fill="FFFF00"/>
-          <w:lang w:val="en-GB"/>
-        </w:rPr>
-        <w:t>[...]</w:t>
+      <w:r>
+        <w:t>Your handwritten text and voice recording will be used to evaluate the performance as well as the suitability of the OCR and STT models for inclusion in the system.</w:t>
       </w:r>
     </w:p>
     <w:p>
@@ -161,23 +276,38 @@
     </w:p>
     <w:p>
       <w:pPr>
-        <w:spacing w:beforeAutospacing="0" w:after="0" w:line="240" w:lineRule="atLeast"/>
-        <w:jc w:val="both"/>
-        <w:rPr>
-          <w:rFonts w:cs="Arial"/>
-          <w:shd w:val="clear" w:color="auto" w:fill="FFFF00"/>
-          <w:lang w:val="en-GB"/>
-        </w:rPr>
-      </w:pPr>
-      <w:r>
-        <w:rPr>
-          <w:rFonts w:cs="Arial"/>
-          <w:sz w:val="22"/>
-          <w:szCs w:val="22"/>
-          <w:shd w:val="clear" w:color="auto" w:fill="FFFF00"/>
-          <w:lang w:val="en-GB"/>
-        </w:rPr>
-        <w:t>[...]</w:t>
+        <w:pStyle w:val="ListParagraph"/>
+        <w:numPr>
+          <w:ilvl w:val="0"/>
+          <w:numId w:val="3"/>
+        </w:numPr>
+        <w:rPr>
+          <w:lang w:val="en-GB"/>
+        </w:rPr>
+      </w:pPr>
+      <w:r>
+        <w:rPr>
+          <w:lang w:val="en-GB"/>
+        </w:rPr>
+        <w:t>Copy an essay in your handwriting and submit and image of it for processing</w:t>
+      </w:r>
+    </w:p>
+    <w:p>
+      <w:pPr>
+        <w:pStyle w:val="ListParagraph"/>
+        <w:numPr>
+          <w:ilvl w:val="0"/>
+          <w:numId w:val="3"/>
+        </w:numPr>
+        <w:rPr>
+          <w:lang w:val="en-GB"/>
+        </w:rPr>
+      </w:pPr>
+      <w:r>
+        <w:rPr>
+          <w:lang w:val="en-GB"/>
+        </w:rPr>
+        <w:t>Submit a recording of your voice reading your handwritten essay for processing</w:t>
       </w:r>
     </w:p>
     <w:p>
@@ -243,25 +373,17 @@
         <w:pStyle w:val="ListParagraph"/>
         <w:numPr>
           <w:ilvl w:val="0"/>
-          <w:numId w:val="1"/>
+          <w:numId w:val="4"/>
         </w:numPr>
-        <w:spacing w:beforeAutospacing="0" w:after="0" w:line="240" w:lineRule="atLeast"/>
-        <w:jc w:val="both"/>
-        <w:rPr>
-          <w:rFonts w:cs="Arial"/>
-          <w:shd w:val="clear" w:color="auto" w:fill="FFFF00"/>
-          <w:lang w:val="en-GB"/>
-        </w:rPr>
-      </w:pPr>
-      <w:r>
-        <w:rPr>
-          <w:rFonts w:cs="Arial"/>
-          <w:sz w:val="22"/>
-          <w:szCs w:val="22"/>
-          <w:shd w:val="clear" w:color="auto" w:fill="FFFF00"/>
-          <w:lang w:val="en-GB"/>
-        </w:rPr>
-        <w:t>[...]</w:t>
+        <w:rPr>
+          <w:lang w:val="en-GB"/>
+        </w:rPr>
+      </w:pPr>
+      <w:r>
+        <w:rPr>
+          <w:lang w:val="en-GB"/>
+        </w:rPr>
+        <w:t>Essay image – Optical Character Recognition – the handwritten text will be extracted and converted to digital text for processed</w:t>
       </w:r>
     </w:p>
     <w:p>
@@ -269,26 +391,30 @@
         <w:pStyle w:val="ListParagraph"/>
         <w:numPr>
           <w:ilvl w:val="0"/>
-          <w:numId w:val="1"/>
+          <w:numId w:val="4"/>
         </w:numPr>
+        <w:rPr>
+          <w:lang w:val="en-GB"/>
+        </w:rPr>
+      </w:pPr>
+      <w:r>
+        <w:rPr>
+          <w:lang w:val="en-GB"/>
+        </w:rPr>
+        <w:t>Your audio voice recording will be transcribed – converted to digital text and processed</w:t>
+      </w:r>
+    </w:p>
+    <w:p>
+      <w:pPr>
         <w:spacing w:beforeAutospacing="0" w:after="0" w:line="240" w:lineRule="atLeast"/>
         <w:jc w:val="both"/>
         <w:rPr>
           <w:rFonts w:cs="Arial"/>
-          <w:shd w:val="clear" w:color="auto" w:fill="FFFF00"/>
-          <w:lang w:val="en-GB"/>
-        </w:rPr>
-      </w:pPr>
-      <w:r>
-        <w:rPr>
-          <w:rFonts w:cs="Arial"/>
           <w:sz w:val="22"/>
           <w:szCs w:val="22"/>
-          <w:shd w:val="clear" w:color="auto" w:fill="FFFF00"/>
-          <w:lang w:val="en-GB"/>
-        </w:rPr>
-        <w:t>[...]</w:t>
-      </w:r>
+          <w:lang w:val="en-GB"/>
+        </w:rPr>
+      </w:pPr>
     </w:p>
     <w:p>
       <w:pPr>
@@ -296,11 +422,18 @@
         <w:jc w:val="both"/>
         <w:rPr>
           <w:rFonts w:cs="Arial"/>
+          <w:lang w:val="en-GB"/>
+        </w:rPr>
+      </w:pPr>
+      <w:r>
+        <w:rPr>
+          <w:rFonts w:cs="Arial"/>
           <w:sz w:val="22"/>
           <w:szCs w:val="22"/>
           <w:lang w:val="en-GB"/>
         </w:rPr>
-      </w:pPr>
+        <w:t>You can clarify on the Participant Consent form (PR/001) whether you consent to your identifiable information (name / organisation / position) to be included in the project report.</w:t>
+      </w:r>
     </w:p>
     <w:p>
       <w:pPr>
@@ -308,18 +441,11 @@
         <w:jc w:val="both"/>
         <w:rPr>
           <w:rFonts w:cs="Arial"/>
-          <w:lang w:val="en-GB"/>
-        </w:rPr>
-      </w:pPr>
-      <w:r>
-        <w:rPr>
-          <w:rFonts w:cs="Arial"/>
           <w:sz w:val="22"/>
           <w:szCs w:val="22"/>
           <w:lang w:val="en-GB"/>
         </w:rPr>
-        <w:t>You can clarify on the Participant Consent form (PR/001) whether you consent to your identifiable information (name / organisation / position) to be included in the project report.</w:t>
-      </w:r>
+      </w:pPr>
     </w:p>
     <w:p>
       <w:pPr>
@@ -327,11 +453,18 @@
         <w:jc w:val="both"/>
         <w:rPr>
           <w:rFonts w:cs="Arial"/>
+          <w:lang w:val="en-GB"/>
+        </w:rPr>
+      </w:pPr>
+      <w:r>
+        <w:rPr>
+          <w:rFonts w:cs="Arial"/>
           <w:sz w:val="22"/>
           <w:szCs w:val="22"/>
           <w:lang w:val="en-GB"/>
         </w:rPr>
-      </w:pPr>
+        <w:t>This identifiable information (your “personal data”) will be stored securely by the principle project researcher.</w:t>
+      </w:r>
     </w:p>
     <w:p>
       <w:pPr>
@@ -339,19 +472,21 @@
         <w:jc w:val="both"/>
         <w:rPr>
           <w:rFonts w:cs="Arial"/>
-          <w:lang w:val="en-GB"/>
-        </w:rPr>
-      </w:pPr>
-      <w:r>
-        <w:rPr>
-          <w:rFonts w:cs="Arial"/>
           <w:sz w:val="22"/>
           <w:szCs w:val="22"/>
           <w:lang w:val="en-GB"/>
         </w:rPr>
-        <w:t xml:space="preserve">This identifiable information (your “personal data”) will be stored securely by the </w:t>
-      </w:r>
-      <w:proofErr w:type="gramStart"/>
+      </w:pPr>
+    </w:p>
+    <w:p>
+      <w:pPr>
+        <w:spacing w:beforeAutospacing="0" w:after="0" w:line="240" w:lineRule="atLeast"/>
+        <w:jc w:val="both"/>
+        <w:rPr>
+          <w:rFonts w:cs="Arial"/>
+          <w:lang w:val="en-GB"/>
+        </w:rPr>
+      </w:pPr>
       <w:r>
         <w:rPr>
           <w:rFonts w:cs="Arial"/>
@@ -359,9 +494,8 @@
           <w:szCs w:val="22"/>
           <w:lang w:val="en-GB"/>
         </w:rPr>
-        <w:t>principle</w:t>
-      </w:r>
-      <w:proofErr w:type="gramEnd"/>
+        <w:t xml:space="preserve">Your data will be held for up to six months after the end of the project (expected </w:t>
+      </w:r>
       <w:r>
         <w:rPr>
           <w:rFonts w:cs="Arial"/>
@@ -369,48 +503,7 @@
           <w:szCs w:val="22"/>
           <w:lang w:val="en-GB"/>
         </w:rPr>
-        <w:t xml:space="preserve"> project researcher.</w:t>
-      </w:r>
-    </w:p>
-    <w:p>
-      <w:pPr>
-        <w:spacing w:beforeAutospacing="0" w:after="0" w:line="240" w:lineRule="atLeast"/>
-        <w:jc w:val="both"/>
-        <w:rPr>
-          <w:rFonts w:cs="Arial"/>
-          <w:sz w:val="22"/>
-          <w:szCs w:val="22"/>
-          <w:lang w:val="en-GB"/>
-        </w:rPr>
-      </w:pPr>
-    </w:p>
-    <w:p>
-      <w:pPr>
-        <w:spacing w:beforeAutospacing="0" w:after="0" w:line="240" w:lineRule="atLeast"/>
-        <w:jc w:val="both"/>
-        <w:rPr>
-          <w:rFonts w:cs="Arial"/>
-          <w:lang w:val="en-GB"/>
-        </w:rPr>
-      </w:pPr>
-      <w:r>
-        <w:rPr>
-          <w:rFonts w:cs="Arial"/>
-          <w:sz w:val="22"/>
-          <w:szCs w:val="22"/>
-          <w:lang w:val="en-GB"/>
-        </w:rPr>
-        <w:t xml:space="preserve">Your data will be held for up to six months after the end of the project (expected June </w:t>
-      </w:r>
-      <w:r>
-        <w:rPr>
-          <w:rFonts w:cs="Arial"/>
-          <w:sz w:val="22"/>
-          <w:szCs w:val="22"/>
-          <w:shd w:val="clear" w:color="auto" w:fill="FFFF00"/>
-          <w:lang w:val="en-GB"/>
-        </w:rPr>
-        <w:t>YYYY</w:t>
+        <w:t>September 28, 2026</w:t>
       </w:r>
       <w:r>
         <w:rPr>
@@ -475,56 +568,48 @@
           <w:szCs w:val="22"/>
           <w:lang w:val="en-GB"/>
         </w:rPr>
-        <w:t>You can send any questions relating to the processing of your data or request to withdraw your personal data by contacting [</w:t>
-      </w:r>
-      <w:r>
-        <w:rPr>
-          <w:rFonts w:cs="Arial"/>
+        <w:t xml:space="preserve">You can send any questions relating to the processing of your data or request to withdraw your personal data by contacting </w:t>
+      </w:r>
+      <w:r>
+        <w:rPr>
+          <w:rFonts w:cs="Arial"/>
+          <w:b/>
+          <w:bCs/>
           <w:sz w:val="22"/>
           <w:szCs w:val="22"/>
-          <w:shd w:val="clear" w:color="auto" w:fill="FFFF00"/>
-          <w:lang w:val="en-GB"/>
-        </w:rPr>
-        <w:t>name@gold.ac.uk</w:t>
-      </w:r>
-      <w:r>
+          <w:lang w:val="en-GB"/>
+        </w:rPr>
+        <w:t>asadorville@gmail.com.</w:t>
+      </w:r>
+    </w:p>
+    <w:p>
+      <w:pPr>
+        <w:spacing w:beforeAutospacing="0" w:after="0" w:line="240" w:lineRule="atLeast"/>
         <w:rPr>
           <w:rFonts w:cs="Arial"/>
           <w:sz w:val="22"/>
           <w:szCs w:val="22"/>
           <w:lang w:val="en-GB"/>
         </w:rPr>
-        <w:t>].</w:t>
-      </w:r>
+      </w:pPr>
     </w:p>
     <w:p>
       <w:pPr>
         <w:spacing w:beforeAutospacing="0" w:after="0" w:line="240" w:lineRule="atLeast"/>
+        <w:rPr>
+          <w:rFonts w:cs="Arial"/>
+        </w:rPr>
+      </w:pPr>
+      <w:r>
         <w:rPr>
           <w:rFonts w:cs="Arial"/>
           <w:sz w:val="22"/>
           <w:szCs w:val="22"/>
           <w:lang w:val="en-GB"/>
         </w:rPr>
-      </w:pPr>
-    </w:p>
-    <w:p>
-      <w:pPr>
-        <w:spacing w:beforeAutospacing="0" w:after="0" w:line="240" w:lineRule="atLeast"/>
-        <w:rPr>
-          <w:rFonts w:cs="Arial"/>
-        </w:rPr>
-      </w:pPr>
-      <w:r>
-        <w:rPr>
-          <w:rFonts w:cs="Arial"/>
-          <w:sz w:val="22"/>
-          <w:szCs w:val="22"/>
-          <w:lang w:val="en-GB"/>
-        </w:rPr>
         <w:t xml:space="preserve">If you have any concerns about the processing of your personal data or your information rights, please see the </w:t>
       </w:r>
-      <w:hyperlink r:id="rId5" w:tgtFrame="Personal data protection">
+      <w:hyperlink r:id="rId7" w:tgtFrame="Personal data protection">
         <w:r>
           <w:rPr>
             <w:rStyle w:val="Hyperlink"/>
@@ -545,7 +630,7 @@
         </w:rPr>
         <w:t xml:space="preserve">. Or contact the Data Protection Officer: </w:t>
       </w:r>
-      <w:hyperlink r:id="rId6">
+      <w:hyperlink r:id="rId8">
         <w:r>
           <w:rPr>
             <w:rStyle w:val="Hyperlink"/>
@@ -594,7 +679,7 @@
         </w:rPr>
         <w:t xml:space="preserve">You can also contact the Information Commissioners’ Office – </w:t>
       </w:r>
-      <w:hyperlink r:id="rId7">
+      <w:hyperlink r:id="rId9">
         <w:r>
           <w:rPr>
             <w:rStyle w:val="Hyperlink"/>
@@ -624,12 +709,12 @@
       </w:pPr>
     </w:p>
     <w:sectPr>
-      <w:headerReference w:type="even" r:id="rId8"/>
-      <w:headerReference w:type="default" r:id="rId9"/>
-      <w:footerReference w:type="even" r:id="rId10"/>
-      <w:footerReference w:type="default" r:id="rId11"/>
-      <w:headerReference w:type="first" r:id="rId12"/>
-      <w:footerReference w:type="first" r:id="rId13"/>
+      <w:headerReference w:type="even" r:id="rId10"/>
+      <w:headerReference w:type="default" r:id="rId11"/>
+      <w:footerReference w:type="even" r:id="rId12"/>
+      <w:footerReference w:type="default" r:id="rId13"/>
+      <w:headerReference w:type="first" r:id="rId14"/>
+      <w:footerReference w:type="first" r:id="rId15"/>
       <w:pgSz w:w="11906" w:h="16820"/>
       <w:pgMar w:top="1440" w:right="1325" w:bottom="1440" w:left="1134" w:header="708" w:footer="708" w:gutter="0"/>
       <w:cols w:space="720"/>
@@ -639,6 +724,31 @@
     </w:sectPr>
   </w:body>
 </w:document>
+</file>
+
+<file path=word/endnotes.xml><?xml version="1.0" encoding="utf-8"?>
+<w:endnotes xmlns:wpc="http://schemas.microsoft.com/office/word/2010/wordprocessingCanvas" xmlns:cx="http://schemas.microsoft.com/office/drawing/2014/chartex" xmlns:cx1="http://schemas.microsoft.com/office/drawing/2015/9/8/chartex" xmlns:cx2="http://schemas.microsoft.com/office/drawing/2015/10/21/chartex" xmlns:cx3="http://schemas.microsoft.com/office/drawing/2016/5/9/chartex" xmlns:cx4="http://schemas.microsoft.com/office/drawing/2016/5/10/chartex" xmlns:cx5="http://schemas.microsoft.com/office/drawing/2016/5/11/chartex" xmlns:cx6="http://schemas.microsoft.com/office/drawing/2016/5/12/chartex" xmlns:cx7="http://schemas.microsoft.com/office/drawing/2016/5/13/chartex" xmlns:cx8="http://schemas.microsoft.com/office/drawing/2016/5/14/chartex" xmlns:mc="http://schemas.openxmlformats.org/markup-compatibility/2006" xmlns:aink="http://schemas.microsoft.com/office/drawing/2016/ink" xmlns:am3d="http://schemas.microsoft.com/office/drawing/2017/model3d" xmlns:o="urn:schemas-microsoft-com:office:office" xmlns:oel="http://schemas.microsoft.com/office/2019/extlst" xmlns:r="http://schemas.openxmlformats.org/officeDocument/2006/relationships" xmlns:m="http://schemas.openxmlformats.org/officeDocument/2006/math" xmlns:v="urn:schemas-microsoft-com:vml" xmlns:wp14="http://schemas.microsoft.com/office/word/2010/wordprocessingDrawing" xmlns:wp="http://schemas.openxmlformats.org/drawingml/2006/wordprocessingDrawing" xmlns:w10="urn:schemas-microsoft-com:office:word" xmlns:w="http://schemas.openxmlformats.org/wordprocessingml/2006/main" xmlns:w14="http://schemas.microsoft.com/office/word/2010/wordml" xmlns:w15="http://schemas.microsoft.com/office/word/2012/wordml" xmlns:w16cex="http://schemas.microsoft.com/office/word/2018/wordml/cex" xmlns:w16cid="http://schemas.microsoft.com/office/word/2016/wordml/cid" xmlns:w16="http://schemas.microsoft.com/office/word/2018/wordml" xmlns:w16du="http://schemas.microsoft.com/office/word/2023/wordml/word16du" xmlns:w16sdtdh="http://schemas.microsoft.com/office/word/2020/wordml/sdtdatahash" xmlns:w16sdtfl="http://schemas.microsoft.com/office/word/2024/wordml/sdtformatlock" xmlns:w16se="http://schemas.microsoft.com/office/word/2015/wordml/symex" xmlns:wpg="http://schemas.microsoft.com/office/word/2010/wordprocessingGroup" xmlns:wpi="http://schemas.microsoft.com/office/word/2010/wordprocessingInk" xmlns:wne="http://schemas.microsoft.com/office/word/2006/wordml" xmlns:wps="http://schemas.microsoft.com/office/word/2010/wordprocessingShape" mc:Ignorable="w14 w15 w16se w16cid w16 w16cex w16sdtdh w16sdtfl w16du wp14">
+  <w:endnote w:type="separator" w:id="-1">
+    <w:p>
+      <w:pPr>
+        <w:spacing w:after="0" w:line="240" w:lineRule="auto"/>
+      </w:pPr>
+      <w:r>
+        <w:separator/>
+      </w:r>
+    </w:p>
+  </w:endnote>
+  <w:endnote w:type="continuationSeparator" w:id="0">
+    <w:p>
+      <w:pPr>
+        <w:spacing w:after="0" w:line="240" w:lineRule="auto"/>
+      </w:pPr>
+      <w:r>
+        <w:continuationSeparator/>
+      </w:r>
+    </w:p>
+  </w:endnote>
+</w:endnotes>
 </file>
 
 <file path=word/footer1.xml><?xml version="1.0" encoding="utf-8"?>
@@ -963,6 +1073,31 @@
     </w:pPr>
   </w:p>
 </w:ftr>
+</file>
+
+<file path=word/footnotes.xml><?xml version="1.0" encoding="utf-8"?>
+<w:footnotes xmlns:wpc="http://schemas.microsoft.com/office/word/2010/wordprocessingCanvas" xmlns:cx="http://schemas.microsoft.com/office/drawing/2014/chartex" xmlns:cx1="http://schemas.microsoft.com/office/drawing/2015/9/8/chartex" xmlns:cx2="http://schemas.microsoft.com/office/drawing/2015/10/21/chartex" xmlns:cx3="http://schemas.microsoft.com/office/drawing/2016/5/9/chartex" xmlns:cx4="http://schemas.microsoft.com/office/drawing/2016/5/10/chartex" xmlns:cx5="http://schemas.microsoft.com/office/drawing/2016/5/11/chartex" xmlns:cx6="http://schemas.microsoft.com/office/drawing/2016/5/12/chartex" xmlns:cx7="http://schemas.microsoft.com/office/drawing/2016/5/13/chartex" xmlns:cx8="http://schemas.microsoft.com/office/drawing/2016/5/14/chartex" xmlns:mc="http://schemas.openxmlformats.org/markup-compatibility/2006" xmlns:aink="http://schemas.microsoft.com/office/drawing/2016/ink" xmlns:am3d="http://schemas.microsoft.com/office/drawing/2017/model3d" xmlns:o="urn:schemas-microsoft-com:office:office" xmlns:oel="http://schemas.microsoft.com/office/2019/extlst" xmlns:r="http://schemas.openxmlformats.org/officeDocument/2006/relationships" xmlns:m="http://schemas.openxmlformats.org/officeDocument/2006/math" xmlns:v="urn:schemas-microsoft-com:vml" xmlns:wp14="http://schemas.microsoft.com/office/word/2010/wordprocessingDrawing" xmlns:wp="http://schemas.openxmlformats.org/drawingml/2006/wordprocessingDrawing" xmlns:w10="urn:schemas-microsoft-com:office:word" xmlns:w="http://schemas.openxmlformats.org/wordprocessingml/2006/main" xmlns:w14="http://schemas.microsoft.com/office/word/2010/wordml" xmlns:w15="http://schemas.microsoft.com/office/word/2012/wordml" xmlns:w16cex="http://schemas.microsoft.com/office/word/2018/wordml/cex" xmlns:w16cid="http://schemas.microsoft.com/office/word/2016/wordml/cid" xmlns:w16="http://schemas.microsoft.com/office/word/2018/wordml" xmlns:w16du="http://schemas.microsoft.com/office/word/2023/wordml/word16du" xmlns:w16sdtdh="http://schemas.microsoft.com/office/word/2020/wordml/sdtdatahash" xmlns:w16sdtfl="http://schemas.microsoft.com/office/word/2024/wordml/sdtformatlock" xmlns:w16se="http://schemas.microsoft.com/office/word/2015/wordml/symex" xmlns:wpg="http://schemas.microsoft.com/office/word/2010/wordprocessingGroup" xmlns:wpi="http://schemas.microsoft.com/office/word/2010/wordprocessingInk" xmlns:wne="http://schemas.microsoft.com/office/word/2006/wordml" xmlns:wps="http://schemas.microsoft.com/office/word/2010/wordprocessingShape" mc:Ignorable="w14 w15 w16se w16cid w16 w16cex w16sdtdh w16sdtfl w16du wp14">
+  <w:footnote w:type="separator" w:id="-1">
+    <w:p>
+      <w:pPr>
+        <w:spacing w:after="0" w:line="240" w:lineRule="auto"/>
+      </w:pPr>
+      <w:r>
+        <w:separator/>
+      </w:r>
+    </w:p>
+  </w:footnote>
+  <w:footnote w:type="continuationSeparator" w:id="0">
+    <w:p>
+      <w:pPr>
+        <w:spacing w:after="0" w:line="240" w:lineRule="auto"/>
+      </w:pPr>
+      <w:r>
+        <w:continuationSeparator/>
+      </w:r>
+    </w:p>
+  </w:footnote>
+</w:footnotes>
 </file>
 
 <file path=word/header1.xml><?xml version="1.0" encoding="utf-8"?>
@@ -1042,6 +1177,272 @@
 <file path=word/numbering.xml><?xml version="1.0" encoding="utf-8"?>
 <w:numbering xmlns:wpc="http://schemas.microsoft.com/office/word/2010/wordprocessingCanvas" xmlns:cx="http://schemas.microsoft.com/office/drawing/2014/chartex" xmlns:cx1="http://schemas.microsoft.com/office/drawing/2015/9/8/chartex" xmlns:cx2="http://schemas.microsoft.com/office/drawing/2015/10/21/chartex" xmlns:cx3="http://schemas.microsoft.com/office/drawing/2016/5/9/chartex" xmlns:cx4="http://schemas.microsoft.com/office/drawing/2016/5/10/chartex" xmlns:cx5="http://schemas.microsoft.com/office/drawing/2016/5/11/chartex" xmlns:cx6="http://schemas.microsoft.com/office/drawing/2016/5/12/chartex" xmlns:cx7="http://schemas.microsoft.com/office/drawing/2016/5/13/chartex" xmlns:cx8="http://schemas.microsoft.com/office/drawing/2016/5/14/chartex" xmlns:mc="http://schemas.openxmlformats.org/markup-compatibility/2006" xmlns:aink="http://schemas.microsoft.com/office/drawing/2016/ink" xmlns:am3d="http://schemas.microsoft.com/office/drawing/2017/model3d" xmlns:o="urn:schemas-microsoft-com:office:office" xmlns:oel="http://schemas.microsoft.com/office/2019/extlst" xmlns:r="http://schemas.openxmlformats.org/officeDocument/2006/relationships" xmlns:m="http://schemas.openxmlformats.org/officeDocument/2006/math" xmlns:v="urn:schemas-microsoft-com:vml" xmlns:wp14="http://schemas.microsoft.com/office/word/2010/wordprocessingDrawing" xmlns:wp="http://schemas.openxmlformats.org/drawingml/2006/wordprocessingDrawing" xmlns:w10="urn:schemas-microsoft-com:office:word" xmlns:w="http://schemas.openxmlformats.org/wordprocessingml/2006/main" xmlns:w14="http://schemas.microsoft.com/office/word/2010/wordml" xmlns:w15="http://schemas.microsoft.com/office/word/2012/wordml" xmlns:w16cex="http://schemas.microsoft.com/office/word/2018/wordml/cex" xmlns:w16cid="http://schemas.microsoft.com/office/word/2016/wordml/cid" xmlns:w16="http://schemas.microsoft.com/office/word/2018/wordml" xmlns:w16du="http://schemas.microsoft.com/office/word/2023/wordml/word16du" xmlns:w16sdtdh="http://schemas.microsoft.com/office/word/2020/wordml/sdtdatahash" xmlns:w16sdtfl="http://schemas.microsoft.com/office/word/2024/wordml/sdtformatlock" xmlns:w16se="http://schemas.microsoft.com/office/word/2015/wordml/symex" xmlns:wpg="http://schemas.microsoft.com/office/word/2010/wordprocessingGroup" xmlns:wpi="http://schemas.microsoft.com/office/word/2010/wordprocessingInk" xmlns:wne="http://schemas.microsoft.com/office/word/2006/wordml" xmlns:wps="http://schemas.microsoft.com/office/word/2010/wordprocessingShape" mc:Ignorable="w14 w15 w16se w16cid w16 w16cex w16sdtdh w16sdtfl w16du wp14">
   <w:abstractNum w:abstractNumId="0" w15:restartNumberingAfterBreak="0">
+    <w:nsid w:val="01885F16"/>
+    <w:multiLevelType w:val="hybridMultilevel"/>
+    <w:tmpl w:val="25800554"/>
+    <w:lvl w:ilvl="0" w:tplc="1C24D7C2">
+      <w:start w:val="1"/>
+      <w:numFmt w:val="decimal"/>
+      <w:lvlText w:val="%1)"/>
+      <w:lvlJc w:val="left"/>
+      <w:pPr>
+        <w:ind w:left="720" w:hanging="360"/>
+      </w:pPr>
+      <w:rPr>
+        <w:rFonts w:hint="default"/>
+        <w:sz w:val="22"/>
+      </w:rPr>
+    </w:lvl>
+    <w:lvl w:ilvl="1" w:tplc="08090019" w:tentative="1">
+      <w:start w:val="1"/>
+      <w:numFmt w:val="lowerLetter"/>
+      <w:lvlText w:val="%2."/>
+      <w:lvlJc w:val="left"/>
+      <w:pPr>
+        <w:ind w:left="1440" w:hanging="360"/>
+      </w:pPr>
+    </w:lvl>
+    <w:lvl w:ilvl="2" w:tplc="0809001B" w:tentative="1">
+      <w:start w:val="1"/>
+      <w:numFmt w:val="lowerRoman"/>
+      <w:lvlText w:val="%3."/>
+      <w:lvlJc w:val="right"/>
+      <w:pPr>
+        <w:ind w:left="2160" w:hanging="180"/>
+      </w:pPr>
+    </w:lvl>
+    <w:lvl w:ilvl="3" w:tplc="0809000F" w:tentative="1">
+      <w:start w:val="1"/>
+      <w:numFmt w:val="decimal"/>
+      <w:lvlText w:val="%4."/>
+      <w:lvlJc w:val="left"/>
+      <w:pPr>
+        <w:ind w:left="2880" w:hanging="360"/>
+      </w:pPr>
+    </w:lvl>
+    <w:lvl w:ilvl="4" w:tplc="08090019" w:tentative="1">
+      <w:start w:val="1"/>
+      <w:numFmt w:val="lowerLetter"/>
+      <w:lvlText w:val="%5."/>
+      <w:lvlJc w:val="left"/>
+      <w:pPr>
+        <w:ind w:left="3600" w:hanging="360"/>
+      </w:pPr>
+    </w:lvl>
+    <w:lvl w:ilvl="5" w:tplc="0809001B" w:tentative="1">
+      <w:start w:val="1"/>
+      <w:numFmt w:val="lowerRoman"/>
+      <w:lvlText w:val="%6."/>
+      <w:lvlJc w:val="right"/>
+      <w:pPr>
+        <w:ind w:left="4320" w:hanging="180"/>
+      </w:pPr>
+    </w:lvl>
+    <w:lvl w:ilvl="6" w:tplc="0809000F" w:tentative="1">
+      <w:start w:val="1"/>
+      <w:numFmt w:val="decimal"/>
+      <w:lvlText w:val="%7."/>
+      <w:lvlJc w:val="left"/>
+      <w:pPr>
+        <w:ind w:left="5040" w:hanging="360"/>
+      </w:pPr>
+    </w:lvl>
+    <w:lvl w:ilvl="7" w:tplc="08090019" w:tentative="1">
+      <w:start w:val="1"/>
+      <w:numFmt w:val="lowerLetter"/>
+      <w:lvlText w:val="%8."/>
+      <w:lvlJc w:val="left"/>
+      <w:pPr>
+        <w:ind w:left="5760" w:hanging="360"/>
+      </w:pPr>
+    </w:lvl>
+    <w:lvl w:ilvl="8" w:tplc="0809001B" w:tentative="1">
+      <w:start w:val="1"/>
+      <w:numFmt w:val="lowerRoman"/>
+      <w:lvlText w:val="%9."/>
+      <w:lvlJc w:val="right"/>
+      <w:pPr>
+        <w:ind w:left="6480" w:hanging="180"/>
+      </w:pPr>
+    </w:lvl>
+  </w:abstractNum>
+  <w:abstractNum w:abstractNumId="1" w15:restartNumberingAfterBreak="0">
+    <w:nsid w:val="05401A67"/>
+    <w:multiLevelType w:val="hybridMultilevel"/>
+    <w:tmpl w:val="0F381338"/>
+    <w:lvl w:ilvl="0" w:tplc="08090017">
+      <w:start w:val="1"/>
+      <w:numFmt w:val="lowerLetter"/>
+      <w:lvlText w:val="%1)"/>
+      <w:lvlJc w:val="left"/>
+      <w:pPr>
+        <w:ind w:left="720" w:hanging="360"/>
+      </w:pPr>
+    </w:lvl>
+    <w:lvl w:ilvl="1" w:tplc="08090019" w:tentative="1">
+      <w:start w:val="1"/>
+      <w:numFmt w:val="lowerLetter"/>
+      <w:lvlText w:val="%2."/>
+      <w:lvlJc w:val="left"/>
+      <w:pPr>
+        <w:ind w:left="1440" w:hanging="360"/>
+      </w:pPr>
+    </w:lvl>
+    <w:lvl w:ilvl="2" w:tplc="0809001B" w:tentative="1">
+      <w:start w:val="1"/>
+      <w:numFmt w:val="lowerRoman"/>
+      <w:lvlText w:val="%3."/>
+      <w:lvlJc w:val="right"/>
+      <w:pPr>
+        <w:ind w:left="2160" w:hanging="180"/>
+      </w:pPr>
+    </w:lvl>
+    <w:lvl w:ilvl="3" w:tplc="0809000F" w:tentative="1">
+      <w:start w:val="1"/>
+      <w:numFmt w:val="decimal"/>
+      <w:lvlText w:val="%4."/>
+      <w:lvlJc w:val="left"/>
+      <w:pPr>
+        <w:ind w:left="2880" w:hanging="360"/>
+      </w:pPr>
+    </w:lvl>
+    <w:lvl w:ilvl="4" w:tplc="08090019" w:tentative="1">
+      <w:start w:val="1"/>
+      <w:numFmt w:val="lowerLetter"/>
+      <w:lvlText w:val="%5."/>
+      <w:lvlJc w:val="left"/>
+      <w:pPr>
+        <w:ind w:left="3600" w:hanging="360"/>
+      </w:pPr>
+    </w:lvl>
+    <w:lvl w:ilvl="5" w:tplc="0809001B" w:tentative="1">
+      <w:start w:val="1"/>
+      <w:numFmt w:val="lowerRoman"/>
+      <w:lvlText w:val="%6."/>
+      <w:lvlJc w:val="right"/>
+      <w:pPr>
+        <w:ind w:left="4320" w:hanging="180"/>
+      </w:pPr>
+    </w:lvl>
+    <w:lvl w:ilvl="6" w:tplc="0809000F" w:tentative="1">
+      <w:start w:val="1"/>
+      <w:numFmt w:val="decimal"/>
+      <w:lvlText w:val="%7."/>
+      <w:lvlJc w:val="left"/>
+      <w:pPr>
+        <w:ind w:left="5040" w:hanging="360"/>
+      </w:pPr>
+    </w:lvl>
+    <w:lvl w:ilvl="7" w:tplc="08090019" w:tentative="1">
+      <w:start w:val="1"/>
+      <w:numFmt w:val="lowerLetter"/>
+      <w:lvlText w:val="%8."/>
+      <w:lvlJc w:val="left"/>
+      <w:pPr>
+        <w:ind w:left="5760" w:hanging="360"/>
+      </w:pPr>
+    </w:lvl>
+    <w:lvl w:ilvl="8" w:tplc="0809001B" w:tentative="1">
+      <w:start w:val="1"/>
+      <w:numFmt w:val="lowerRoman"/>
+      <w:lvlText w:val="%9."/>
+      <w:lvlJc w:val="right"/>
+      <w:pPr>
+        <w:ind w:left="6480" w:hanging="180"/>
+      </w:pPr>
+    </w:lvl>
+  </w:abstractNum>
+  <w:abstractNum w:abstractNumId="2" w15:restartNumberingAfterBreak="0">
+    <w:nsid w:val="0DB50611"/>
+    <w:multiLevelType w:val="hybridMultilevel"/>
+    <w:tmpl w:val="33BC1C56"/>
+    <w:lvl w:ilvl="0" w:tplc="1C24D7C2">
+      <w:start w:val="1"/>
+      <w:numFmt w:val="decimal"/>
+      <w:lvlText w:val="%1)"/>
+      <w:lvlJc w:val="left"/>
+      <w:pPr>
+        <w:ind w:left="720" w:hanging="360"/>
+      </w:pPr>
+      <w:rPr>
+        <w:rFonts w:hint="default"/>
+        <w:sz w:val="22"/>
+      </w:rPr>
+    </w:lvl>
+    <w:lvl w:ilvl="1" w:tplc="08090019" w:tentative="1">
+      <w:start w:val="1"/>
+      <w:numFmt w:val="lowerLetter"/>
+      <w:lvlText w:val="%2."/>
+      <w:lvlJc w:val="left"/>
+      <w:pPr>
+        <w:ind w:left="1440" w:hanging="360"/>
+      </w:pPr>
+    </w:lvl>
+    <w:lvl w:ilvl="2" w:tplc="0809001B" w:tentative="1">
+      <w:start w:val="1"/>
+      <w:numFmt w:val="lowerRoman"/>
+      <w:lvlText w:val="%3."/>
+      <w:lvlJc w:val="right"/>
+      <w:pPr>
+        <w:ind w:left="2160" w:hanging="180"/>
+      </w:pPr>
+    </w:lvl>
+    <w:lvl w:ilvl="3" w:tplc="0809000F" w:tentative="1">
+      <w:start w:val="1"/>
+      <w:numFmt w:val="decimal"/>
+      <w:lvlText w:val="%4."/>
+      <w:lvlJc w:val="left"/>
+      <w:pPr>
+        <w:ind w:left="2880" w:hanging="360"/>
+      </w:pPr>
+    </w:lvl>
+    <w:lvl w:ilvl="4" w:tplc="08090019" w:tentative="1">
+      <w:start w:val="1"/>
+      <w:numFmt w:val="lowerLetter"/>
+      <w:lvlText w:val="%5."/>
+      <w:lvlJc w:val="left"/>
+      <w:pPr>
+        <w:ind w:left="3600" w:hanging="360"/>
+      </w:pPr>
+    </w:lvl>
+    <w:lvl w:ilvl="5" w:tplc="0809001B" w:tentative="1">
+      <w:start w:val="1"/>
+      <w:numFmt w:val="lowerRoman"/>
+      <w:lvlText w:val="%6."/>
+      <w:lvlJc w:val="right"/>
+      <w:pPr>
+        <w:ind w:left="4320" w:hanging="180"/>
+      </w:pPr>
+    </w:lvl>
+    <w:lvl w:ilvl="6" w:tplc="0809000F" w:tentative="1">
+      <w:start w:val="1"/>
+      <w:numFmt w:val="decimal"/>
+      <w:lvlText w:val="%7."/>
+      <w:lvlJc w:val="left"/>
+      <w:pPr>
+        <w:ind w:left="5040" w:hanging="360"/>
+      </w:pPr>
+    </w:lvl>
+    <w:lvl w:ilvl="7" w:tplc="08090019" w:tentative="1">
+      <w:start w:val="1"/>
+      <w:numFmt w:val="lowerLetter"/>
+      <w:lvlText w:val="%8."/>
+      <w:lvlJc w:val="left"/>
+      <w:pPr>
+        <w:ind w:left="5760" w:hanging="360"/>
+      </w:pPr>
+    </w:lvl>
+    <w:lvl w:ilvl="8" w:tplc="0809001B" w:tentative="1">
+      <w:start w:val="1"/>
+      <w:numFmt w:val="lowerRoman"/>
+      <w:lvlText w:val="%9."/>
+      <w:lvlJc w:val="right"/>
+      <w:pPr>
+        <w:ind w:left="6480" w:hanging="180"/>
+      </w:pPr>
+    </w:lvl>
+  </w:abstractNum>
+  <w:abstractNum w:abstractNumId="3" w15:restartNumberingAfterBreak="0">
     <w:nsid w:val="502A199F"/>
     <w:multiLevelType w:val="multilevel"/>
     <w:tmpl w:val="1DA478A4"/>
@@ -1154,7 +1555,202 @@
       </w:pPr>
     </w:lvl>
   </w:abstractNum>
+  <w:abstractNum w:abstractNumId="4" w15:restartNumberingAfterBreak="0">
+    <w:nsid w:val="697A311D"/>
+    <w:multiLevelType w:val="hybridMultilevel"/>
+    <w:tmpl w:val="EABA9EBA"/>
+    <w:lvl w:ilvl="0" w:tplc="1C24D7C2">
+      <w:start w:val="1"/>
+      <w:numFmt w:val="decimal"/>
+      <w:lvlText w:val="%1)"/>
+      <w:lvlJc w:val="left"/>
+      <w:pPr>
+        <w:ind w:left="720" w:hanging="360"/>
+      </w:pPr>
+      <w:rPr>
+        <w:rFonts w:hint="default"/>
+        <w:sz w:val="22"/>
+      </w:rPr>
+    </w:lvl>
+    <w:lvl w:ilvl="1" w:tplc="08090019" w:tentative="1">
+      <w:start w:val="1"/>
+      <w:numFmt w:val="lowerLetter"/>
+      <w:lvlText w:val="%2."/>
+      <w:lvlJc w:val="left"/>
+      <w:pPr>
+        <w:ind w:left="1440" w:hanging="360"/>
+      </w:pPr>
+    </w:lvl>
+    <w:lvl w:ilvl="2" w:tplc="0809001B" w:tentative="1">
+      <w:start w:val="1"/>
+      <w:numFmt w:val="lowerRoman"/>
+      <w:lvlText w:val="%3."/>
+      <w:lvlJc w:val="right"/>
+      <w:pPr>
+        <w:ind w:left="2160" w:hanging="180"/>
+      </w:pPr>
+    </w:lvl>
+    <w:lvl w:ilvl="3" w:tplc="0809000F" w:tentative="1">
+      <w:start w:val="1"/>
+      <w:numFmt w:val="decimal"/>
+      <w:lvlText w:val="%4."/>
+      <w:lvlJc w:val="left"/>
+      <w:pPr>
+        <w:ind w:left="2880" w:hanging="360"/>
+      </w:pPr>
+    </w:lvl>
+    <w:lvl w:ilvl="4" w:tplc="08090019" w:tentative="1">
+      <w:start w:val="1"/>
+      <w:numFmt w:val="lowerLetter"/>
+      <w:lvlText w:val="%5."/>
+      <w:lvlJc w:val="left"/>
+      <w:pPr>
+        <w:ind w:left="3600" w:hanging="360"/>
+      </w:pPr>
+    </w:lvl>
+    <w:lvl w:ilvl="5" w:tplc="0809001B" w:tentative="1">
+      <w:start w:val="1"/>
+      <w:numFmt w:val="lowerRoman"/>
+      <w:lvlText w:val="%6."/>
+      <w:lvlJc w:val="right"/>
+      <w:pPr>
+        <w:ind w:left="4320" w:hanging="180"/>
+      </w:pPr>
+    </w:lvl>
+    <w:lvl w:ilvl="6" w:tplc="0809000F" w:tentative="1">
+      <w:start w:val="1"/>
+      <w:numFmt w:val="decimal"/>
+      <w:lvlText w:val="%7."/>
+      <w:lvlJc w:val="left"/>
+      <w:pPr>
+        <w:ind w:left="5040" w:hanging="360"/>
+      </w:pPr>
+    </w:lvl>
+    <w:lvl w:ilvl="7" w:tplc="08090019" w:tentative="1">
+      <w:start w:val="1"/>
+      <w:numFmt w:val="lowerLetter"/>
+      <w:lvlText w:val="%8."/>
+      <w:lvlJc w:val="left"/>
+      <w:pPr>
+        <w:ind w:left="5760" w:hanging="360"/>
+      </w:pPr>
+    </w:lvl>
+    <w:lvl w:ilvl="8" w:tplc="0809001B" w:tentative="1">
+      <w:start w:val="1"/>
+      <w:numFmt w:val="lowerRoman"/>
+      <w:lvlText w:val="%9."/>
+      <w:lvlJc w:val="right"/>
+      <w:pPr>
+        <w:ind w:left="6480" w:hanging="180"/>
+      </w:pPr>
+    </w:lvl>
+  </w:abstractNum>
+  <w:abstractNum w:abstractNumId="5" w15:restartNumberingAfterBreak="0">
+    <w:nsid w:val="71965512"/>
+    <w:multiLevelType w:val="hybridMultilevel"/>
+    <w:tmpl w:val="96F0E032"/>
+    <w:lvl w:ilvl="0" w:tplc="1C24D7C2">
+      <w:start w:val="1"/>
+      <w:numFmt w:val="decimal"/>
+      <w:lvlText w:val="%1)"/>
+      <w:lvlJc w:val="left"/>
+      <w:pPr>
+        <w:ind w:left="720" w:hanging="360"/>
+      </w:pPr>
+      <w:rPr>
+        <w:rFonts w:hint="default"/>
+        <w:sz w:val="22"/>
+      </w:rPr>
+    </w:lvl>
+    <w:lvl w:ilvl="1" w:tplc="08090019" w:tentative="1">
+      <w:start w:val="1"/>
+      <w:numFmt w:val="lowerLetter"/>
+      <w:lvlText w:val="%2."/>
+      <w:lvlJc w:val="left"/>
+      <w:pPr>
+        <w:ind w:left="1440" w:hanging="360"/>
+      </w:pPr>
+    </w:lvl>
+    <w:lvl w:ilvl="2" w:tplc="0809001B" w:tentative="1">
+      <w:start w:val="1"/>
+      <w:numFmt w:val="lowerRoman"/>
+      <w:lvlText w:val="%3."/>
+      <w:lvlJc w:val="right"/>
+      <w:pPr>
+        <w:ind w:left="2160" w:hanging="180"/>
+      </w:pPr>
+    </w:lvl>
+    <w:lvl w:ilvl="3" w:tplc="0809000F" w:tentative="1">
+      <w:start w:val="1"/>
+      <w:numFmt w:val="decimal"/>
+      <w:lvlText w:val="%4."/>
+      <w:lvlJc w:val="left"/>
+      <w:pPr>
+        <w:ind w:left="2880" w:hanging="360"/>
+      </w:pPr>
+    </w:lvl>
+    <w:lvl w:ilvl="4" w:tplc="08090019" w:tentative="1">
+      <w:start w:val="1"/>
+      <w:numFmt w:val="lowerLetter"/>
+      <w:lvlText w:val="%5."/>
+      <w:lvlJc w:val="left"/>
+      <w:pPr>
+        <w:ind w:left="3600" w:hanging="360"/>
+      </w:pPr>
+    </w:lvl>
+    <w:lvl w:ilvl="5" w:tplc="0809001B" w:tentative="1">
+      <w:start w:val="1"/>
+      <w:numFmt w:val="lowerRoman"/>
+      <w:lvlText w:val="%6."/>
+      <w:lvlJc w:val="right"/>
+      <w:pPr>
+        <w:ind w:left="4320" w:hanging="180"/>
+      </w:pPr>
+    </w:lvl>
+    <w:lvl w:ilvl="6" w:tplc="0809000F" w:tentative="1">
+      <w:start w:val="1"/>
+      <w:numFmt w:val="decimal"/>
+      <w:lvlText w:val="%7."/>
+      <w:lvlJc w:val="left"/>
+      <w:pPr>
+        <w:ind w:left="5040" w:hanging="360"/>
+      </w:pPr>
+    </w:lvl>
+    <w:lvl w:ilvl="7" w:tplc="08090019" w:tentative="1">
+      <w:start w:val="1"/>
+      <w:numFmt w:val="lowerLetter"/>
+      <w:lvlText w:val="%8."/>
+      <w:lvlJc w:val="left"/>
+      <w:pPr>
+        <w:ind w:left="5760" w:hanging="360"/>
+      </w:pPr>
+    </w:lvl>
+    <w:lvl w:ilvl="8" w:tplc="0809001B" w:tentative="1">
+      <w:start w:val="1"/>
+      <w:numFmt w:val="lowerRoman"/>
+      <w:lvlText w:val="%9."/>
+      <w:lvlJc w:val="right"/>
+      <w:pPr>
+        <w:ind w:left="6480" w:hanging="180"/>
+      </w:pPr>
+    </w:lvl>
+  </w:abstractNum>
   <w:num w:numId="1" w16cid:durableId="220480538">
+    <w:abstractNumId w:val="3"/>
+  </w:num>
+  <w:num w:numId="2" w16cid:durableId="364596709">
+    <w:abstractNumId w:val="4"/>
+  </w:num>
+  <w:num w:numId="3" w16cid:durableId="813328396">
+    <w:abstractNumId w:val="5"/>
+  </w:num>
+  <w:num w:numId="4" w16cid:durableId="1411002220">
+    <w:abstractNumId w:val="1"/>
+  </w:num>
+  <w:num w:numId="5" w16cid:durableId="736132718">
+    <w:abstractNumId w:val="2"/>
+  </w:num>
+  <w:num w:numId="6" w16cid:durableId="1340424099">
     <w:abstractNumId w:val="0"/>
   </w:num>
 </w:numbering>

</xml_diff>